<commit_message>
Update the documentation UML diagram images
Co-authored-by: Dhruvin Vekariya <dhruvin.200410116086@gmail.com>
Co-authored-by: Qiblatain Fatima <qiblatain@live.com>
Signed-off-by: Abdul Moeez <abdulmoeez1225@gmail.com>
</commit_message>
<xml_diff>
--- a/Documentation/Taskorbit Conversational Agent System Architecture.docx
+++ b/Documentation/Taskorbit Conversational Agent System Architecture.docx
@@ -67,19 +67,19 @@
         </w:rPr>
         <w:drawing>
           <wp:inline distB="114300" distT="114300" distL="114300" distR="114300">
-            <wp:extent cx="5943600" cy="2095500"/>
+            <wp:extent cx="5631158" cy="6605782"/>
             <wp:effectExtent b="0" l="0" r="0" t="0"/>
-            <wp:docPr id="3" name="image1.png"/>
+            <wp:docPr id="3" name="image3.png"/>
             <a:graphic>
               <a:graphicData uri="http://schemas.openxmlformats.org/drawingml/2006/picture">
                 <pic:pic>
                   <pic:nvPicPr>
-                    <pic:cNvPr id="0" name="image1.png"/>
+                    <pic:cNvPr id="0" name="image3.png"/>
                     <pic:cNvPicPr preferRelativeResize="0"/>
                   </pic:nvPicPr>
                   <pic:blipFill>
                     <a:blip r:embed="rId6"/>
-                    <a:srcRect b="0" l="0" r="0" t="0"/>
+                    <a:srcRect b="-2590" l="0" r="-2590" t="0"/>
                     <a:stretch>
                       <a:fillRect/>
                     </a:stretch>
@@ -87,7 +87,7 @@
                   <pic:spPr>
                     <a:xfrm>
                       <a:off x="0" y="0"/>
-                      <a:ext cx="5943600" cy="2095500"/>
+                      <a:ext cx="5631158" cy="6605782"/>
                     </a:xfrm>
                     <a:prstGeom prst="rect"/>
                     <a:ln/>
@@ -216,12 +216,12 @@
           <wp:inline distB="114300" distT="114300" distL="114300" distR="114300">
             <wp:extent cx="6504619" cy="2162175"/>
             <wp:effectExtent b="0" l="0" r="0" t="0"/>
-            <wp:docPr id="1" name="image2.png"/>
+            <wp:docPr id="1" name="image1.png"/>
             <a:graphic>
               <a:graphicData uri="http://schemas.openxmlformats.org/drawingml/2006/picture">
                 <pic:pic>
                   <pic:nvPicPr>
-                    <pic:cNvPr id="0" name="image2.png"/>
+                    <pic:cNvPr id="0" name="image1.png"/>
                     <pic:cNvPicPr preferRelativeResize="0"/>
                   </pic:nvPicPr>
                   <pic:blipFill>
@@ -2581,12 +2581,12 @@
           <wp:inline distB="114300" distT="114300" distL="114300" distR="114300">
             <wp:extent cx="5943600" cy="1397000"/>
             <wp:effectExtent b="0" l="0" r="0" t="0"/>
-            <wp:docPr id="2" name="image3.png"/>
+            <wp:docPr id="2" name="image2.png"/>
             <a:graphic>
               <a:graphicData uri="http://schemas.openxmlformats.org/drawingml/2006/picture">
                 <pic:pic>
                   <pic:nvPicPr>
-                    <pic:cNvPr id="0" name="image3.png"/>
+                    <pic:cNvPr id="0" name="image2.png"/>
                     <pic:cNvPicPr preferRelativeResize="0"/>
                   </pic:nvPicPr>
                   <pic:blipFill>

</xml_diff>

<commit_message>
Improve and update documentation diagram visuals
Co-authored-by: Qiblatain Fatima <qiblatain@live.com>
Signed-off-by: Abdul Moeez <abdulmoeez1225@gmail.com>
</commit_message>
<xml_diff>
--- a/Documentation/Taskorbit Conversational Agent System Architecture.docx
+++ b/Documentation/Taskorbit Conversational Agent System Architecture.docx
@@ -15,9 +15,32 @@
         <w:rPr>
           <w:rtl w:val="0"/>
         </w:rPr>
-        <w:t xml:space="preserve">Planned Software Architecture</w:t>
-        <w:br w:type="textWrapping"/>
-        <w:t xml:space="preserve">Voice Agent System</w:t>
+        <w:t xml:space="preserve">Taskorbit Conversational Agent System Architecture</w:t>
+      </w:r>
+    </w:p>
+    <w:p>
+      <w:pPr>
+        <w:rPr/>
+      </w:pPr>
+      <w:r>
+        <w:rPr>
+          <w:rtl w:val="0"/>
+        </w:rPr>
+      </w:r>
+    </w:p>
+    <w:p>
+      <w:pPr>
+        <w:pStyle w:val="Heading2"/>
+        <w:spacing w:after="200" w:before="200" w:line="250.9085454545454" w:lineRule="auto"/>
+        <w:rPr/>
+      </w:pPr>
+      <w:bookmarkStart w:colFirst="0" w:colLast="0" w:name="_3rrl6lcsq60v" w:id="1"/>
+      <w:bookmarkEnd w:id="1"/>
+      <w:r>
+        <w:rPr>
+          <w:rtl w:val="0"/>
+        </w:rPr>
+        <w:t xml:space="preserve">1. Runtime Components Overview</w:t>
       </w:r>
     </w:p>
     <w:p>
@@ -31,43 +54,13 @@
       </w:pPr>
       <w:r>
         <w:rPr>
-          <w:rtl w:val="0"/>
-        </w:rPr>
-      </w:r>
-    </w:p>
-    <w:p>
-      <w:pPr>
-        <w:pStyle w:val="Heading2"/>
-        <w:spacing w:after="200" w:before="200" w:line="250.9085454545454" w:lineRule="auto"/>
-        <w:rPr/>
-      </w:pPr>
-      <w:bookmarkStart w:colFirst="0" w:colLast="0" w:name="_3rrl6lcsq60v" w:id="1"/>
-      <w:bookmarkEnd w:id="1"/>
-      <w:r>
-        <w:rPr>
-          <w:rtl w:val="0"/>
-        </w:rPr>
-        <w:t xml:space="preserve">1. Runtime Components Overview</w:t>
-      </w:r>
-    </w:p>
-    <w:p>
-      <w:pPr>
-        <w:spacing w:after="200" w:before="200" w:line="250.9085454545454" w:lineRule="auto"/>
-        <w:rPr>
           <w:rFonts w:ascii="Times New Roman" w:cs="Times New Roman" w:eastAsia="Times New Roman" w:hAnsi="Times New Roman"/>
           <w:sz w:val="20"/>
           <w:szCs w:val="20"/>
         </w:rPr>
-      </w:pPr>
-      <w:r>
-        <w:rPr>
-          <w:rFonts w:ascii="Times New Roman" w:cs="Times New Roman" w:eastAsia="Times New Roman" w:hAnsi="Times New Roman"/>
-          <w:sz w:val="20"/>
-          <w:szCs w:val="20"/>
-        </w:rPr>
         <w:drawing>
           <wp:inline distB="114300" distT="114300" distL="114300" distR="114300">
-            <wp:extent cx="5631158" cy="6605782"/>
+            <wp:extent cx="5327694" cy="6232930"/>
             <wp:effectExtent b="0" l="0" r="0" t="0"/>
             <wp:docPr id="3" name="image3.png"/>
             <a:graphic>
@@ -87,7 +80,7 @@
                   <pic:spPr>
                     <a:xfrm>
                       <a:off x="0" y="0"/>
-                      <a:ext cx="5631158" cy="6605782"/>
+                      <a:ext cx="5327694" cy="6232930"/>
                     </a:xfrm>
                     <a:prstGeom prst="rect"/>
                     <a:ln/>
@@ -108,11 +101,7 @@
       <w:pPr>
         <w:spacing w:after="200" w:before="200" w:line="250.9085454545454" w:lineRule="auto"/>
         <w:jc w:val="center"/>
-        <w:rPr>
-          <w:rFonts w:ascii="Times New Roman" w:cs="Times New Roman" w:eastAsia="Times New Roman" w:hAnsi="Times New Roman"/>
-          <w:sz w:val="18"/>
-          <w:szCs w:val="18"/>
-        </w:rPr>
+        <w:rPr/>
       </w:pPr>
       <w:r>
         <w:rPr>
@@ -133,17 +122,6 @@
     </w:p>
     <w:p>
       <w:pPr>
-        <w:spacing w:after="200" w:before="200" w:line="250.9085454545454" w:lineRule="auto"/>
-        <w:rPr/>
-      </w:pPr>
-      <w:r>
-        <w:rPr>
-          <w:rtl w:val="0"/>
-        </w:rPr>
-      </w:r>
-    </w:p>
-    <w:p>
-      <w:pPr>
         <w:pStyle w:val="Heading2"/>
         <w:spacing w:after="200" w:before="200" w:line="250.9085454545454" w:lineRule="auto"/>
         <w:rPr/>
@@ -214,7 +192,7 @@
         </w:rPr>
         <w:drawing>
           <wp:inline distB="114300" distT="114300" distL="114300" distR="114300">
-            <wp:extent cx="6504619" cy="2162175"/>
+            <wp:extent cx="6519863" cy="2060876"/>
             <wp:effectExtent b="0" l="0" r="0" t="0"/>
             <wp:docPr id="1" name="image1.png"/>
             <a:graphic>
@@ -226,7 +204,7 @@
                   </pic:nvPicPr>
                   <pic:blipFill>
                     <a:blip r:embed="rId7"/>
-                    <a:srcRect b="0" l="0" r="-1652" t="0"/>
+                    <a:srcRect b="0" l="0" r="0" t="0"/>
                     <a:stretch>
                       <a:fillRect/>
                     </a:stretch>
@@ -234,7 +212,7 @@
                   <pic:spPr>
                     <a:xfrm>
                       <a:off x="0" y="0"/>
-                      <a:ext cx="6504619" cy="2162175"/>
+                      <a:ext cx="6519863" cy="2060876"/>
                     </a:xfrm>
                     <a:prstGeom prst="rect"/>
                     <a:ln/>
@@ -273,131 +251,6 @@
           <w:rtl w:val="0"/>
         </w:rPr>
         <w:t xml:space="preserve">Figure 2. Logical code architecture and main dependencies.</w:t>
-      </w:r>
-    </w:p>
-    <w:p>
-      <w:pPr>
-        <w:spacing w:after="200" w:before="200" w:line="250.9085454545454" w:lineRule="auto"/>
-        <w:rPr>
-          <w:rFonts w:ascii="Times New Roman" w:cs="Times New Roman" w:eastAsia="Times New Roman" w:hAnsi="Times New Roman"/>
-          <w:i w:val="1"/>
-          <w:iCs w:val="1"/>
-          <w:sz w:val="18"/>
-          <w:szCs w:val="18"/>
-        </w:rPr>
-      </w:pPr>
-      <w:r>
-        <w:rPr>
-          <w:rFonts w:ascii="Times New Roman" w:cs="Times New Roman" w:eastAsia="Times New Roman" w:hAnsi="Times New Roman"/>
-          <w:i w:val="1"/>
-          <w:iCs w:val="1"/>
-          <w:sz w:val="18"/>
-          <w:szCs w:val="18"/>
-          <w:rtl w:val="0"/>
-        </w:rPr>
-        <w:br w:type="textWrapping"/>
-      </w:r>
-    </w:p>
-    <w:p>
-      <w:pPr>
-        <w:spacing w:after="200" w:before="200" w:line="250.9085454545454" w:lineRule="auto"/>
-        <w:rPr>
-          <w:rFonts w:ascii="Times New Roman" w:cs="Times New Roman" w:eastAsia="Times New Roman" w:hAnsi="Times New Roman"/>
-          <w:i w:val="1"/>
-          <w:iCs w:val="1"/>
-          <w:sz w:val="18"/>
-          <w:szCs w:val="18"/>
-        </w:rPr>
-      </w:pPr>
-      <w:r>
-        <w:rPr>
-          <w:rtl w:val="0"/>
-        </w:rPr>
-      </w:r>
-    </w:p>
-    <w:p>
-      <w:pPr>
-        <w:spacing w:after="200" w:before="200" w:line="250.9085454545454" w:lineRule="auto"/>
-        <w:rPr>
-          <w:rFonts w:ascii="Times New Roman" w:cs="Times New Roman" w:eastAsia="Times New Roman" w:hAnsi="Times New Roman"/>
-          <w:i w:val="1"/>
-          <w:iCs w:val="1"/>
-          <w:sz w:val="18"/>
-          <w:szCs w:val="18"/>
-        </w:rPr>
-      </w:pPr>
-      <w:r>
-        <w:rPr>
-          <w:rtl w:val="0"/>
-        </w:rPr>
-      </w:r>
-    </w:p>
-    <w:p>
-      <w:pPr>
-        <w:spacing w:after="200" w:before="200" w:line="250.9085454545454" w:lineRule="auto"/>
-        <w:rPr>
-          <w:rFonts w:ascii="Times New Roman" w:cs="Times New Roman" w:eastAsia="Times New Roman" w:hAnsi="Times New Roman"/>
-          <w:i w:val="1"/>
-          <w:iCs w:val="1"/>
-          <w:sz w:val="18"/>
-          <w:szCs w:val="18"/>
-        </w:rPr>
-      </w:pPr>
-      <w:r>
-        <w:rPr>
-          <w:rtl w:val="0"/>
-        </w:rPr>
-      </w:r>
-    </w:p>
-    <w:p>
-      <w:pPr>
-        <w:spacing w:after="200" w:before="200" w:line="250.9085454545454" w:lineRule="auto"/>
-        <w:rPr>
-          <w:rFonts w:ascii="Times New Roman" w:cs="Times New Roman" w:eastAsia="Times New Roman" w:hAnsi="Times New Roman"/>
-          <w:i w:val="1"/>
-          <w:iCs w:val="1"/>
-          <w:sz w:val="18"/>
-          <w:szCs w:val="18"/>
-        </w:rPr>
-      </w:pPr>
-      <w:r>
-        <w:rPr>
-          <w:rtl w:val="0"/>
-        </w:rPr>
-      </w:r>
-    </w:p>
-    <w:p>
-      <w:pPr>
-        <w:spacing w:after="200" w:before="200" w:line="250.9085454545454" w:lineRule="auto"/>
-        <w:rPr>
-          <w:rFonts w:ascii="Times New Roman" w:cs="Times New Roman" w:eastAsia="Times New Roman" w:hAnsi="Times New Roman"/>
-          <w:i w:val="1"/>
-          <w:iCs w:val="1"/>
-          <w:sz w:val="18"/>
-          <w:szCs w:val="18"/>
-        </w:rPr>
-      </w:pPr>
-      <w:r>
-        <w:rPr>
-          <w:rtl w:val="0"/>
-        </w:rPr>
-      </w:r>
-    </w:p>
-    <w:p>
-      <w:pPr>
-        <w:spacing w:after="200" w:before="200" w:line="250.9085454545454" w:lineRule="auto"/>
-        <w:rPr>
-          <w:rFonts w:ascii="Times New Roman" w:cs="Times New Roman" w:eastAsia="Times New Roman" w:hAnsi="Times New Roman"/>
-          <w:i w:val="1"/>
-          <w:iCs w:val="1"/>
-          <w:sz w:val="18"/>
-          <w:szCs w:val="18"/>
-        </w:rPr>
-      </w:pPr>
-      <w:r>
-        <w:rPr>
-          <w:rtl w:val="0"/>
-        </w:rPr>
       </w:r>
     </w:p>
     <w:p>

</xml_diff>